<commit_message>
Add GitHub URL to report
Co-Authored-By: Claude Opus 5.5 <noreply@anthropic.com>
</commit_message>
<xml_diff>
--- a/report/AAT_Report_Suraj_T_1DS23AI058.docx
+++ b/report/AAT_Report_Suraj_T_1DS23AI058.docx
@@ -3136,7 +3136,7 @@
                 <w:color w:val="000000"/>
                 <w:sz w:val="21"/>
               </w:rPr>
-              <w:t>https://github.com/&lt;github-username&gt;/genai-risk-dashboard</w:t>
+              <w:t>https://github.com/imsuraj034/genai-risk-dashboard</w:t>
             </w:r>
           </w:p>
         </w:tc>
@@ -3228,7 +3228,7 @@
         <w:spacing w:before="240" w:after="120" w:line="276" w:lineRule="auto"/>
         <w:jc w:val="left"/>
       </w:pPr>
-      <w:bookmarkStart w:id="46931" w:name="ch1"/>
+      <w:bookmarkStart w:id="46752" w:name="ch1"/>
       <w:r>
         <w:rPr>
           <w:rFonts w:ascii="Times New Roman" w:hAnsi="Times New Roman" w:cs="Times New Roman" w:eastAsia="Times New Roman"/>
@@ -3239,7 +3239,7 @@
         </w:rPr>
         <w:t>1. ABSTRACT</w:t>
       </w:r>
-      <w:bookmarkEnd w:id="46931"/>
+      <w:bookmarkEnd w:id="46752"/>
     </w:p>
     <w:p>
       <w:pPr>
@@ -3347,7 +3347,7 @@
         <w:spacing w:before="240" w:after="120" w:line="276" w:lineRule="auto"/>
         <w:jc w:val="left"/>
       </w:pPr>
-      <w:bookmarkStart w:id="86709" w:name="ch2"/>
+      <w:bookmarkStart w:id="38547" w:name="ch2"/>
       <w:r>
         <w:rPr>
           <w:rFonts w:ascii="Times New Roman" w:hAnsi="Times New Roman" w:cs="Times New Roman" w:eastAsia="Times New Roman"/>
@@ -3358,7 +3358,7 @@
         </w:rPr>
         <w:t>2. INTRODUCTION</w:t>
       </w:r>
-      <w:bookmarkEnd w:id="86709"/>
+      <w:bookmarkEnd w:id="38547"/>
     </w:p>
     <w:p>
       <w:pPr>
@@ -4286,7 +4286,7 @@
         <w:spacing w:before="240" w:after="120" w:line="276" w:lineRule="auto"/>
         <w:jc w:val="left"/>
       </w:pPr>
-      <w:bookmarkStart w:id="58628" w:name="ch3"/>
+      <w:bookmarkStart w:id="56977" w:name="ch3"/>
       <w:r>
         <w:rPr>
           <w:rFonts w:ascii="Times New Roman" w:hAnsi="Times New Roman" w:cs="Times New Roman" w:eastAsia="Times New Roman"/>
@@ -4297,7 +4297,7 @@
         </w:rPr>
         <w:t>3. PROBLEM STATEMENT AND OBJECTIVES</w:t>
       </w:r>
-      <w:bookmarkEnd w:id="58628"/>
+      <w:bookmarkEnd w:id="56977"/>
     </w:p>
     <w:p>
       <w:pPr>
@@ -6089,7 +6089,7 @@
         <w:spacing w:before="240" w:after="120" w:line="276" w:lineRule="auto"/>
         <w:jc w:val="left"/>
       </w:pPr>
-      <w:bookmarkStart w:id="45727" w:name="ch4"/>
+      <w:bookmarkStart w:id="91223" w:name="ch4"/>
       <w:r>
         <w:rPr>
           <w:rFonts w:ascii="Times New Roman" w:hAnsi="Times New Roman" w:cs="Times New Roman" w:eastAsia="Times New Roman"/>
@@ -6100,7 +6100,7 @@
         </w:rPr>
         <w:t>4. PROPOSED SOLUTION / METHODOLOGY</w:t>
       </w:r>
-      <w:bookmarkEnd w:id="45727"/>
+      <w:bookmarkEnd w:id="91223"/>
     </w:p>
     <w:p>
       <w:pPr>
@@ -8960,7 +8960,7 @@
         <w:spacing w:before="240" w:after="120" w:line="276" w:lineRule="auto"/>
         <w:jc w:val="left"/>
       </w:pPr>
-      <w:bookmarkStart w:id="37531" w:name="ch5"/>
+      <w:bookmarkStart w:id="26620" w:name="ch5"/>
       <w:r>
         <w:rPr>
           <w:rFonts w:ascii="Times New Roman" w:hAnsi="Times New Roman" w:cs="Times New Roman" w:eastAsia="Times New Roman"/>
@@ -8971,7 +8971,7 @@
         </w:rPr>
         <w:t>5. SECURITY AND PRIVACY ASPECTS</w:t>
       </w:r>
-      <w:bookmarkEnd w:id="37531"/>
+      <w:bookmarkEnd w:id="26620"/>
     </w:p>
     <w:p>
       <w:pPr>
@@ -10982,7 +10982,7 @@
         <w:spacing w:before="240" w:after="120" w:line="276" w:lineRule="auto"/>
         <w:jc w:val="left"/>
       </w:pPr>
-      <w:bookmarkStart w:id="53842" w:name="ch6"/>
+      <w:bookmarkStart w:id="8248" w:name="ch6"/>
       <w:r>
         <w:rPr>
           <w:rFonts w:ascii="Times New Roman" w:hAnsi="Times New Roman" w:cs="Times New Roman" w:eastAsia="Times New Roman"/>
@@ -10993,7 +10993,7 @@
         </w:rPr>
         <w:t>6. IMPLEMENTATION AND RESULTS</w:t>
       </w:r>
-      <w:bookmarkEnd w:id="53842"/>
+      <w:bookmarkEnd w:id="8248"/>
     </w:p>
     <w:p>
       <w:pPr>
@@ -12602,7 +12602,7 @@
         <w:spacing w:before="240" w:after="120" w:line="276" w:lineRule="auto"/>
         <w:jc w:val="left"/>
       </w:pPr>
-      <w:bookmarkStart w:id="90076" w:name="ch7"/>
+      <w:bookmarkStart w:id="74385" w:name="ch7"/>
       <w:r>
         <w:rPr>
           <w:rFonts w:ascii="Times New Roman" w:hAnsi="Times New Roman" w:cs="Times New Roman" w:eastAsia="Times New Roman"/>
@@ -12613,7 +12613,7 @@
         </w:rPr>
         <w:t>7. TESTING</w:t>
       </w:r>
-      <w:bookmarkEnd w:id="90076"/>
+      <w:bookmarkEnd w:id="74385"/>
     </w:p>
     <w:p>
       <w:pPr>
@@ -17417,7 +17417,7 @@
         <w:spacing w:before="240" w:after="120" w:line="276" w:lineRule="auto"/>
         <w:jc w:val="left"/>
       </w:pPr>
-      <w:bookmarkStart w:id="83443" w:name="ch8"/>
+      <w:bookmarkStart w:id="10449" w:name="ch8"/>
       <w:r>
         <w:rPr>
           <w:rFonts w:ascii="Times New Roman" w:hAnsi="Times New Roman" w:cs="Times New Roman" w:eastAsia="Times New Roman"/>
@@ -17428,7 +17428,7 @@
         </w:rPr>
         <w:t>8. CONCLUSION AND FUTURE ENHANCEMENTS</w:t>
       </w:r>
-      <w:bookmarkEnd w:id="83443"/>
+      <w:bookmarkEnd w:id="10449"/>
     </w:p>
     <w:p>
       <w:pPr>
@@ -19798,7 +19798,7 @@
         <w:spacing w:before="240" w:after="120" w:line="276" w:lineRule="auto"/>
         <w:jc w:val="left"/>
       </w:pPr>
-      <w:bookmarkStart w:id="92496" w:name="ch9"/>
+      <w:bookmarkStart w:id="80922" w:name="ch9"/>
       <w:r>
         <w:rPr>
           <w:rFonts w:ascii="Times New Roman" w:hAnsi="Times New Roman" w:cs="Times New Roman" w:eastAsia="Times New Roman"/>
@@ -19809,7 +19809,7 @@
         </w:rPr>
         <w:t>9. REFERENCES</w:t>
       </w:r>
-      <w:bookmarkEnd w:id="92496"/>
+      <w:bookmarkEnd w:id="80922"/>
     </w:p>
     <w:p>
       <w:pPr>
@@ -20095,7 +20095,7 @@
         <w:spacing w:before="240" w:after="120" w:line="276" w:lineRule="auto"/>
         <w:jc w:val="left"/>
       </w:pPr>
-      <w:bookmarkStart w:id="6241" w:name="ch10"/>
+      <w:bookmarkStart w:id="31290" w:name="ch10"/>
       <w:r>
         <w:rPr>
           <w:rFonts w:ascii="Times New Roman" w:hAnsi="Times New Roman" w:cs="Times New Roman" w:eastAsia="Times New Roman"/>
@@ -20106,7 +20106,7 @@
         </w:rPr>
         <w:t>10. APPENDIX – SOURCE CODE / SCREENSHOTS</w:t>
       </w:r>
-      <w:bookmarkEnd w:id="6241"/>
+      <w:bookmarkEnd w:id="31290"/>
     </w:p>
     <w:p>
       <w:pPr>
@@ -20150,7 +20150,7 @@
           <w:color w:val="000000"/>
           <w:sz w:val="24"/>
         </w:rPr>
-        <w:t>https://github.com/&lt;github-username&gt;/genai-risk-dashboard</w:t>
+        <w:t>https://github.com/imsuraj034/genai-risk-dashboard</w:t>
       </w:r>
     </w:p>
     <w:p>

</xml_diff>